<commit_message>
Add Project 9: Comprehensive Banking Dashboard and update README
</commit_message>
<xml_diff>
--- a/Project 9/Comprehensive Banking Dashboard.docx
+++ b/Project 9/Comprehensive Banking Dashboard.docx
@@ -25,6 +25,11 @@
           <w:t>https://bankingdashboard-analysis.netlify.app/</w:t>
         </w:r>
       </w:hyperlink>
+    </w:p>
+    <w:p>
+      <w:r>
+        <w:t>The data to be used should have variables in certain arrangement, check the data set in this folder, try to upload in the dashboard for analysis as well</w:t>
+      </w:r>
     </w:p>
     <w:p/>
     <w:sectPr>
@@ -640,6 +645,7 @@
   <w:style w:type="character" w:default="1" w:styleId="DefaultParagraphFont">
     <w:name w:val="Default Paragraph Font"/>
     <w:uiPriority w:val="1"/>
+    <w:semiHidden/>
     <w:unhideWhenUsed/>
   </w:style>
   <w:style w:type="table" w:default="1" w:styleId="TableNormal">

</xml_diff>